<commit_message>
fix em dashes in report
</commit_message>
<xml_diff>
--- a/report/Final_Report.docx
+++ b/report/Final_Report.docx
@@ -401,7 +401,7 @@
           <w:i w:val="0"/>
           <w:sz w:val="24"/>
         </w:rPr>
-        <w:t>Manipal Institute of Technology, Manipal, Karnataka – 576104</w:t>
+        <w:t>Manipal Institute of Technology, Manipal, Karnataka - 576104</w:t>
       </w:r>
     </w:p>
     <w:p>
@@ -436,7 +436,7 @@
           <w:i w:val="0"/>
           <w:sz w:val="24"/>
         </w:rPr>
-        <w:t>Image convolution underpins a large class of image processing tasks ranging from classical spatial filtering to the convolutional layers of modern deep learning networks. Although GPU hardware offers significant parallelism, a straightforward CUDA implementation of 2-D convolution makes no effort to reuse data cached on-chip and ends up issuing the same global memory reads repeatedly, leaving most of the device bandwidth idle. This project addresses that inefficiency through two optimisations. The first loads a tile of input pixels, together with a border region of width equal to the kernel radius, into shared memory once per thread block; subsequent computation then reads entirely from on-chip storage. The second decomposes a separable 2-D kernel into a horizontal and a vertical 1-D pass, each tiled independently, reducing the arithmetic work per output pixel from O(K²) to O(2K). Both optimisations are implemented from scratch in CUDA C++ and benchmarked on an NVIDIA GeForce RTX 4070 Laptop GPU against a sequential CPU reference and a naive GPU baseline. Tests span four kernel radii (r ∈ {1, 3, 7, 15}) and four image resolutions (256×256 to 2048×2048). The tiled kernel achieves up to 1.74× better throughput than the naive kernel for the same kernel size, while the separable kernel yields the largest end-to-end speedups—reaching 8495× over the CPU reference at the widest kernel and largest image tested. All three GPU implementations were verified to produce numerically correct results within floating-point tolerance across every test configuration.</w:t>
+        <w:t>Image convolution underpins a large class of image processing tasks ranging from classical spatial filtering to the convolutional layers of modern deep learning networks. Although GPU hardware offers significant parallelism, a straightforward CUDA implementation of 2-D convolution makes no effort to reuse data cached on-chip and ends up issuing the same global memory reads repeatedly, leaving most of the device bandwidth idle. This project addresses that inefficiency through two optimisations. The first loads a tile of input pixels, together with a border region of width equal to the kernel radius, into shared memory once per thread block; subsequent computation then reads entirely from on-chip storage. The second decomposes a separable 2-D kernel into a horizontal and a vertical 1-D pass, each tiled independently, reducing the arithmetic work per output pixel from O(K²) to O(2K). Both optimisations are implemented from scratch in CUDA C++ and benchmarked on an NVIDIA GeForce RTX 4070 Laptop GPU against a sequential CPU reference and a naive GPU baseline. Tests span four kernel radii (r ∈ {1, 3, 7, 15}) and four image resolutions (256×256 to 2048×2048). The tiled kernel achieves up to 1.74× better throughput than the naive kernel for the same kernel size, while the separable kernel yields the largest end-to-end speedups, reaching 8495× over the CPU reference at the widest kernel and largest image tested. All three GPU implementations were verified to produce numerically correct results within floating-point tolerance across every test configuration.</w:t>
       </w:r>
     </w:p>
     <w:p>
@@ -532,7 +532,7 @@
           <w:i w:val="0"/>
           <w:sz w:val="24"/>
         </w:rPr>
-        <w:t>Two widely studied techniques address this problem. Shared-memory tiling arranges threads within a block to load a contiguous tile of input data—including a border region wide enough to cover the kernel overlap—into shared memory before any arithmetic is performed, so that the expensive global reads happen only once per tile. Separable kernel decomposition exploits the fact that certain important kernels (Gaussian, box, binomial) factor into the outer product of two 1-D vectors, enabling the single 2-D pass to be replaced by two cheaper 1-D passes, each tiled in shared memory.</w:t>
+        <w:t>Two widely studied techniques address this problem. Shared-memory tiling arranges threads within a block to load a contiguous tile of input data, including a border region wide enough to cover the kernel overlap, into shared memory before any arithmetic is performed, so that the expensive global reads happen only once per tile. Separable kernel decomposition exploits the fact that certain important kernels (Gaussian, box, binomial) factor into the outer product of two 1-D vectors, enabling the single 2-D pass to be replaced by two cheaper 1-D passes, each tiled in shared memory.</w:t>
       </w:r>
     </w:p>
     <w:p>
@@ -1337,7 +1337,7 @@
           <w:i w:val="0"/>
           <w:sz w:val="24"/>
         </w:rPr>
-        <w:t>A naive CUDA implementation of 2-D convolution assigns one output pixel to each GPU thread. Each thread independently computes the inner product of its K×K neighbourhood with the filter kernel, fetching every required input pixel directly from global memory. Consider a 16×16 output tile processed by a single thread block. With a 15×15 kernel (r = 7) each of the 256 threads requires 225 input values, for a total of 57,600 global memory reads per block. Yet the unique inputs needed cover only a 30×30 = 900-element apron region—meaning the same data is read an average of 64 times from slow DRAM.</w:t>
+        <w:t>A naive CUDA implementation of 2-D convolution assigns one output pixel to each GPU thread. Each thread independently computes the inner product of its K×K neighbourhood with the filter kernel, fetching every required input pixel directly from global memory. Consider a 16×16 output tile processed by a single thread block. With a 15×15 kernel (r = 7) each of the 256 threads requires 225 input values, for a total of 57,600 global memory reads per block. Yet the unique inputs needed cover only a 30×30 = 900-element apron region, meaning the same data is read an average of 64 times from slow DRAM.</w:t>
       </w:r>
     </w:p>
     <w:p>
@@ -1523,7 +1523,7 @@
           <w:i w:val="0"/>
           <w:sz w:val="24"/>
         </w:rPr>
-        <w:t>Implement a two-pass separable pipeline—horizontal then vertical—each pass independently tiled in shared memory. Use the decomposition to reduce per-pixel arithmetic from O(K²) to O(2K) and verify the result matches the 2-D reference.</w:t>
+        <w:t>Implement a two-pass separable pipeline (horizontal then vertical), each pass independently tiled in shared memory. Use the decomposition to reduce per-pixel arithmetic from O(K²) to O(2K) and verify the result matches the 2-D reference.</w:t>
       </w:r>
     </w:p>
     <w:p>
@@ -1865,7 +1865,7 @@
           <w:i w:val="0"/>
           <w:sz w:val="24"/>
         </w:rPr>
-        <w:t>Out-of-bounds coordinates are clamped to the nearest valid pixel using min(max(index, 0), size−1) (border-replicate / BORDER_REPLICATE in OpenCV terminology). The clamping is applied during the shared-memory load phase for tiled kernels so that the arithmetic phase reads only from shared memory with no per-pixel branching.</w:t>
+        <w:t>Out-of-bounds coordinates are clamped to the nearest valid pixel using min(max(index, 0), size-1) (border-replicate / BORDER_REPLICATE in OpenCV terminology). The clamping is applied during the shared-memory load phase for tiled kernels so that the arithmetic phase reads only from shared memory with no per-pixel branching.</w:t>
       </w:r>
     </w:p>
     <w:p>
@@ -1895,7 +1895,7 @@
           <w:i w:val="0"/>
           <w:sz w:val="24"/>
         </w:rPr>
-        <w:t>For each tested radius r the 1-D Gaussian kernel h is computed as h[k] = exp(−(k−r)² / (2σ²)), with σ = r/2, and normalised to unit sum. The 2-D kernel is the outer product H[i][j] = h[i]·h[j], also normalised. The same h is used for both passes of the separable kernel.</w:t>
+        <w:t>For each tested radius r the 1-D Gaussian kernel h is computed as h[k] = exp(-(k-r)² / (2σ²)), with σ = r/2, and normalised to unit sum. The 2-D kernel is the outer product H[i][j] = h[i]·h[j], also normalised. The same h is used for both passes of the separable kernel.</w:t>
       </w:r>
     </w:p>
     <w:p>
@@ -3185,7 +3185,7 @@
           <w:i w:val="0"/>
           <w:sz w:val="24"/>
         </w:rPr>
-        <w:t>The separable pipeline runs two separate kernel launches. The horizontal kernel loads TILE_H rows, each padded with r elements on each side, into shared memory and convolves every row with the 1-D filter h, writing results to an intermediate device buffer d_temp. The vertical kernel then loads columns from d_temp—each padded with r elements above and below—and applies h along the column direction.</w:t>
+        <w:t>The separable pipeline runs two separate kernel launches. The horizontal kernel loads TILE_H rows, each padded with r elements on each side, into shared memory and convolves every row with the 1-D filter h, writing results to an intermediate device buffer d_temp. The vertical kernel then loads columns from d_temp, each padded with r elements above and below, and applies h along the column direction.</w:t>
       </w:r>
     </w:p>
     <w:p>
@@ -3200,7 +3200,7 @@
           <w:i w:val="0"/>
           <w:sz w:val="24"/>
         </w:rPr>
-        <w:t>The index arithmetic for the horizontal pass is: smem[ty * smW + tx + k] corresponds to input pixel at column (outCol − r + k) in row outRow, so the 1-D sum Σ smem[ty*smW + tx + k] · h[k] reproduces the correct row convolution. An identical argument applies to the vertical pass with rows replacing columns.</w:t>
+        <w:t>The index arithmetic for the horizontal pass is: smem[ty * smW + tx + k] corresponds to input pixel at column (outCol - r + k) in row outRow, so the 1-D sum Σ smem[ty*smW + tx + k] · h[k] reproduces the correct row convolution. An identical argument applies to the vertical pass with rows replacing columns.</w:t>
       </w:r>
     </w:p>
     <w:p>
@@ -3349,7 +3349,7 @@
           <w:i w:val="0"/>
           <w:sz w:val="22"/>
         </w:rPr>
-        <w:t>Table 6.1   Full Benchmark Results — All Resolutions and Kernel Radii</w:t>
+        <w:t>Table 6.1   Full Benchmark Results: All Resolutions and Kernel Radii</w:t>
       </w:r>
     </w:p>
     <w:tbl>
@@ -3609,7 +3609,7 @@
                 <w:i w:val="0"/>
                 <w:sz w:val="20"/>
               </w:rPr>
-              <w:t>—</w:t>
+              <w:t>-</w:t>
             </w:r>
           </w:p>
         </w:tc>
@@ -4149,7 +4149,7 @@
                 <w:i w:val="0"/>
                 <w:sz w:val="20"/>
               </w:rPr>
-              <w:t>—</w:t>
+              <w:t>-</w:t>
             </w:r>
           </w:p>
         </w:tc>
@@ -4689,7 +4689,7 @@
                 <w:i w:val="0"/>
                 <w:sz w:val="20"/>
               </w:rPr>
-              <w:t>—</w:t>
+              <w:t>-</w:t>
             </w:r>
           </w:p>
         </w:tc>
@@ -5229,7 +5229,7 @@
                 <w:i w:val="0"/>
                 <w:sz w:val="20"/>
               </w:rPr>
-              <w:t>—</w:t>
+              <w:t>-</w:t>
             </w:r>
           </w:p>
         </w:tc>
@@ -5769,7 +5769,7 @@
                 <w:i w:val="0"/>
                 <w:sz w:val="20"/>
               </w:rPr>
-              <w:t>—</w:t>
+              <w:t>-</w:t>
             </w:r>
           </w:p>
         </w:tc>
@@ -6309,7 +6309,7 @@
                 <w:i w:val="0"/>
                 <w:sz w:val="20"/>
               </w:rPr>
-              <w:t>—</w:t>
+              <w:t>-</w:t>
             </w:r>
           </w:p>
         </w:tc>
@@ -6849,7 +6849,7 @@
                 <w:i w:val="0"/>
                 <w:sz w:val="20"/>
               </w:rPr>
-              <w:t>—</w:t>
+              <w:t>-</w:t>
             </w:r>
           </w:p>
         </w:tc>
@@ -7389,7 +7389,7 @@
                 <w:i w:val="0"/>
                 <w:sz w:val="20"/>
               </w:rPr>
-              <w:t>—</w:t>
+              <w:t>-</w:t>
             </w:r>
           </w:p>
         </w:tc>
@@ -7929,7 +7929,7 @@
                 <w:i w:val="0"/>
                 <w:sz w:val="20"/>
               </w:rPr>
-              <w:t>—</w:t>
+              <w:t>-</w:t>
             </w:r>
           </w:p>
         </w:tc>
@@ -8469,7 +8469,7 @@
                 <w:i w:val="0"/>
                 <w:sz w:val="20"/>
               </w:rPr>
-              <w:t>—</w:t>
+              <w:t>-</w:t>
             </w:r>
           </w:p>
         </w:tc>
@@ -9009,7 +9009,7 @@
                 <w:i w:val="0"/>
                 <w:sz w:val="20"/>
               </w:rPr>
-              <w:t>—</w:t>
+              <w:t>-</w:t>
             </w:r>
           </w:p>
         </w:tc>
@@ -9549,7 +9549,7 @@
                 <w:i w:val="0"/>
                 <w:sz w:val="20"/>
               </w:rPr>
-              <w:t>—</w:t>
+              <w:t>-</w:t>
             </w:r>
           </w:p>
         </w:tc>
@@ -10089,7 +10089,7 @@
                 <w:i w:val="0"/>
                 <w:sz w:val="20"/>
               </w:rPr>
-              <w:t>—</w:t>
+              <w:t>-</w:t>
             </w:r>
           </w:p>
         </w:tc>
@@ -10629,7 +10629,7 @@
                 <w:i w:val="0"/>
                 <w:sz w:val="20"/>
               </w:rPr>
-              <w:t>—</w:t>
+              <w:t>-</w:t>
             </w:r>
           </w:p>
         </w:tc>
@@ -11169,7 +11169,7 @@
                 <w:i w:val="0"/>
                 <w:sz w:val="20"/>
               </w:rPr>
-              <w:t>—</w:t>
+              <w:t>-</w:t>
             </w:r>
           </w:p>
         </w:tc>
@@ -11709,7 +11709,7 @@
                 <w:i w:val="0"/>
                 <w:sz w:val="20"/>
               </w:rPr>
-              <w:t>—</w:t>
+              <w:t>-</w:t>
             </w:r>
           </w:p>
         </w:tc>
@@ -12216,7 +12216,7 @@
           <w:i w:val="0"/>
           <w:sz w:val="24"/>
         </w:rPr>
-        <w:t>For the smallest kernel tested (3×3, r = 1), the naive kernel is actually faster than the tiled kernel at all resolutions. This is because a 3×3 neighbourhood has very little spatial overlap between adjacent output pixels: the apron adds only 2 border rows and 2 border columns to the 16×16 tile, so the global memory traffic reduction is modest while the shared-memory load overhead is unchanged. The separable kernel is slowest here because two kernel launches carry a fixed dispatch overhead that dominates at this arithmetic intensity. Effective bandwidth for the naive kernel reaches 374 GB/s on 2048×2048, corresponding to 146% of the 256 GB/s peak—consistent with L2 cache hits contributing to the apparent bandwidth.</w:t>
+        <w:t>For the smallest kernel tested (3×3, r = 1), the naive kernel is actually faster than the tiled kernel at all resolutions. This is because a 3×3 neighbourhood has very little spatial overlap between adjacent output pixels: the apron adds only 2 border rows and 2 border columns to the 16×16 tile, so the global memory traffic reduction is modest while the shared-memory load overhead is unchanged. The separable kernel is slowest here because two kernel launches carry a fixed dispatch overhead that dominates at this arithmetic intensity. Effective bandwidth for the naive kernel reaches 374 GB/s on 2048×2048, corresponding to 146% of the 256 GB/s peak, consistent with L2 cache hits contributing to the apparent bandwidth.</w:t>
       </w:r>
     </w:p>
     <w:p>
@@ -13610,7 +13610,7 @@
           <w:i w:val="0"/>
           <w:sz w:val="24"/>
         </w:rPr>
-        <w:t>[3]  P. Getreuer, “A Survey of Gaussian Convolution Algorithms,” Image Processing On Line, vol. 3, pp. 286–310, Nov. 2013. doi: 10.5201/ipol.2013.87.</w:t>
+        <w:t>[3]  P. Getreuer, “A Survey of Gaussian Convolution Algorithms,” Image Processing On Line, vol. 3, pp. 286-310, Nov. 2013. doi: 10.5201/ipol.2013.87.</w:t>
       </w:r>
     </w:p>
     <w:p>
@@ -13626,7 +13626,7 @@
           <w:i w:val="0"/>
           <w:sz w:val="24"/>
         </w:rPr>
-        <w:t>[4]  S. Hong, H. Kim, and J. Lee, “Warp-Level Primitives for Efficient Reduction and Convolution on NVIDIA Ampere GPUs,” in Proc. IEEE IPDPS, Lyon, France, May 2023, pp. 614–624.</w:t>
+        <w:t>[4]  S. Hong, H. Kim, and J. Lee, “Warp-Level Primitives for Efficient Reduction and Convolution on NVIDIA Ampere GPUs,” in Proc. IEEE IPDPS, Lyon, France, May 2023, pp. 614-624.</w:t>
       </w:r>
     </w:p>
     <w:p>
@@ -13690,7 +13690,7 @@
           <w:i w:val="0"/>
           <w:sz w:val="24"/>
         </w:rPr>
-        <w:t>[8]  W. Luk and T. Voss, “Optimising Convolution Operations on FPGAs and GPUs Using Roofline-Guided Design,” in Proc. IEEE FPT, Tianjin, China, Dec. 2022, pp. 1–8.</w:t>
+        <w:t>[8]  W. Luk and T. Voss, “Optimising Convolution Operations on FPGAs and GPUs Using Roofline-Guided Design,” in Proc. IEEE FPT, Tianjin, China, Dec. 2022, pp. 1-8.</w:t>
       </w:r>
     </w:p>
     <w:p>
@@ -13706,7 +13706,7 @@
           <w:i w:val="0"/>
           <w:sz w:val="24"/>
         </w:rPr>
-        <w:t>[9]  S. Williams, A. Waterman, and D. Patterson, “Roofline: An Insightful Visual Performance Model for Multicore Architectures,” Commun. ACM, vol. 52, no. 4, pp. 65–76, Apr. 2009.</w:t>
+        <w:t>[9]  S. Williams, A. Waterman, and D. Patterson, “Roofline: An Insightful Visual Performance Model for Multicore Architectures,” Commun. ACM, vol. 52, no. 4, pp. 65-76, Apr. 2009.</w:t>
       </w:r>
     </w:p>
     <w:p>
@@ -13722,7 +13722,7 @@
           <w:i w:val="0"/>
           <w:sz w:val="24"/>
         </w:rPr>
-        <w:t>[10]  G. Bradski, “The OpenCV Library,” Dr. Dobb’s Journal of Software Tools, vol. 25, pp. 120–125, Nov. 2000.</w:t>
+        <w:t>[10]  G. Bradski, “The OpenCV Library,” Dr. Dobb’s Journal of Software Tools, vol. 25, pp. 120-125, Nov. 2000.</w:t>
       </w:r>
     </w:p>
     <w:sectPr>

</xml_diff>